<commit_message>
feat: Implement walk-in patients, fix API error handling, and reschedule functionality
- Backend: Add WalkInPatient model and CRUD endpoints
- Backend: Fix GetAppointments to support both Patient and WalkInPatient
- Backend: Add reschedule appointment endpoint for reception
- Frontend: Enhance API error handling with safe JSON parsing
- Frontend: Fix reschedule button event listener issues
- Frontend: Add auto-logout on 401 unauthorized
- Mobile: Fix network errors and API integration
- Docs: Add SQL migration scripts for walk-in patients
- Docs: Update Sprint 2 and Sprint 3 documentation
</commit_message>
<xml_diff>
--- a/Docs/Sprint02/Sprint_Planning_S2.docx
+++ b/Docs/Sprint02/Sprint_Planning_S2.docx
@@ -142,7 +142,17 @@
                 <w:sz w:val="24"/>
                 <w:szCs w:val="24"/>
               </w:rPr>
-              <w:t>6/10/2025</w:t>
+              <w:t>04</w:t>
+            </w:r>
+            <w:r>
+              <w:rPr>
+                <w:rFonts w:ascii="Times New Roman" w:eastAsia="Times New Roman" w:hAnsi="Times New Roman" w:cs="Times New Roman"/>
+                <w:b/>
+                <w:bCs/>
+                <w:sz w:val="24"/>
+                <w:szCs w:val="24"/>
+              </w:rPr>
+              <w:t>/10/2025</w:t>
             </w:r>
           </w:p>
         </w:tc>
@@ -188,8 +198,20 @@
                 <w:bCs/>
                 <w:sz w:val="24"/>
                 <w:szCs w:val="24"/>
-              </w:rPr>
-            </w:pPr>
+                <w:lang w:val="vi-VN"/>
+              </w:rPr>
+            </w:pPr>
+            <w:r>
+              <w:rPr>
+                <w:rFonts w:ascii="Times New Roman" w:eastAsia="Times New Roman" w:hAnsi="Times New Roman" w:cs="Times New Roman"/>
+                <w:b/>
+                <w:bCs/>
+                <w:sz w:val="24"/>
+                <w:szCs w:val="24"/>
+                <w:lang w:val="vi-VN"/>
+              </w:rPr>
+              <w:t>10/10/2025</w:t>
+            </w:r>
           </w:p>
         </w:tc>
       </w:tr>
@@ -288,7 +310,7 @@
           <w:sz w:val="24"/>
           <w:szCs w:val="24"/>
         </w:rPr>
-        <w:t xml:space="preserve">Hoàn tất thiết kế giao diện người dùng (UI) cho các trang quan </w:t>
+        <w:t xml:space="preserve">Hoàn tất thiết kế giao diện người dùng (UI) cho các trang </w:t>
       </w:r>
       <w:r>
         <w:rPr>
@@ -296,7 +318,16 @@
           <w:sz w:val="24"/>
           <w:szCs w:val="24"/>
         </w:rPr>
-        <w:t>trọng</w:t>
+        <w:t>thông</w:t>
+      </w:r>
+      <w:r>
+        <w:rPr>
+          <w:rFonts w:ascii="Times New Roman" w:eastAsia="Times New Roman" w:hAnsi="Times New Roman" w:cs="Times New Roman"/>
+          <w:sz w:val="24"/>
+          <w:szCs w:val="24"/>
+          <w:lang w:val="vi-VN"/>
+        </w:rPr>
+        <w:t xml:space="preserve"> tin lịch khám, bảng giá phòng khám, thông tin hướng dẫn khám bệnh, tin tức y tế</w:t>
       </w:r>
       <w:r>
         <w:rPr>
@@ -327,7 +358,7 @@
           <w:sz w:val="24"/>
           <w:szCs w:val="24"/>
         </w:rPr>
-        <w:t xml:space="preserve">Hoàn thành API cho các chức năng tra cứu thông tin cơ </w:t>
+        <w:t xml:space="preserve">Hoàn thành API cho các chức năng </w:t>
       </w:r>
       <w:r>
         <w:rPr>
@@ -335,7 +366,41 @@
           <w:sz w:val="24"/>
           <w:szCs w:val="24"/>
         </w:rPr>
-        <w:t>bản</w:t>
+        <w:t>load</w:t>
+      </w:r>
+      <w:r>
+        <w:rPr>
+          <w:rFonts w:ascii="Times New Roman" w:eastAsia="Times New Roman" w:hAnsi="Times New Roman" w:cs="Times New Roman"/>
+          <w:sz w:val="24"/>
+          <w:szCs w:val="24"/>
+          <w:lang w:val="vi-VN"/>
+        </w:rPr>
+        <w:t xml:space="preserve"> </w:t>
+      </w:r>
+      <w:r>
+        <w:rPr>
+          <w:rFonts w:ascii="Times New Roman" w:eastAsia="Times New Roman" w:hAnsi="Times New Roman" w:cs="Times New Roman"/>
+          <w:sz w:val="24"/>
+          <w:szCs w:val="24"/>
+        </w:rPr>
+        <w:t xml:space="preserve">thông tin </w:t>
+      </w:r>
+      <w:r>
+        <w:rPr>
+          <w:rFonts w:ascii="Times New Roman" w:eastAsia="Times New Roman" w:hAnsi="Times New Roman" w:cs="Times New Roman"/>
+          <w:sz w:val="24"/>
+          <w:szCs w:val="24"/>
+        </w:rPr>
+        <w:t>liên</w:t>
+      </w:r>
+      <w:r>
+        <w:rPr>
+          <w:rFonts w:ascii="Times New Roman" w:eastAsia="Times New Roman" w:hAnsi="Times New Roman" w:cs="Times New Roman"/>
+          <w:sz w:val="24"/>
+          <w:szCs w:val="24"/>
+          <w:lang w:val="vi-VN"/>
+        </w:rPr>
+        <w:t xml:space="preserve"> quan đến các trang</w:t>
       </w:r>
       <w:r>
         <w:rPr>
@@ -781,7 +846,7 @@
                 <w:sz w:val="24"/>
                 <w:szCs w:val="24"/>
               </w:rPr>
-              <w:t>To Do</w:t>
+              <w:t>Done</w:t>
             </w:r>
           </w:p>
         </w:tc>
@@ -949,7 +1014,7 @@
                 <w:sz w:val="24"/>
                 <w:szCs w:val="24"/>
               </w:rPr>
-              <w:t>To Do</w:t>
+              <w:t>Done</w:t>
             </w:r>
           </w:p>
         </w:tc>
@@ -1122,7 +1187,7 @@
                 <w:sz w:val="24"/>
                 <w:szCs w:val="24"/>
               </w:rPr>
-              <w:t>To Do</w:t>
+              <w:t>Done</w:t>
             </w:r>
           </w:p>
         </w:tc>
@@ -1228,16 +1293,7 @@
                 <w:szCs w:val="24"/>
                 <w:lang w:val="vi-VN"/>
               </w:rPr>
-              <w:t xml:space="preserve"> </w:t>
-            </w:r>
-            <w:r>
-              <w:rPr>
-                <w:rFonts w:ascii="Times New Roman" w:eastAsia="Times New Roman" w:hAnsi="Times New Roman" w:cs="Times New Roman"/>
-                <w:sz w:val="24"/>
-                <w:szCs w:val="24"/>
-                <w:lang w:val="vi-VN"/>
-              </w:rPr>
-              <w:t>bình</w:t>
+              <w:t xml:space="preserve"> bình</w:t>
             </w:r>
           </w:p>
         </w:tc>
@@ -1311,7 +1367,7 @@
                 <w:sz w:val="24"/>
                 <w:szCs w:val="24"/>
               </w:rPr>
-              <w:t>To Do</w:t>
+              <w:t>Done</w:t>
             </w:r>
           </w:p>
         </w:tc>
@@ -1486,7 +1542,7 @@
                 <w:sz w:val="24"/>
                 <w:szCs w:val="24"/>
               </w:rPr>
-              <w:t>To Do</w:t>
+              <w:t>Done</w:t>
             </w:r>
           </w:p>
         </w:tc>
@@ -1551,16 +1607,7 @@
                 <w:szCs w:val="24"/>
                 <w:lang w:val="vi-VN"/>
               </w:rPr>
-              <w:t>Xem bảng giá phòng khám</w:t>
-            </w:r>
-            <w:r>
-              <w:rPr>
-                <w:rFonts w:ascii="Times New Roman" w:eastAsia="Times New Roman" w:hAnsi="Times New Roman" w:cs="Times New Roman"/>
-                <w:sz w:val="24"/>
-                <w:szCs w:val="24"/>
-                <w:lang w:val="vi-VN"/>
-              </w:rPr>
-              <w:t>.</w:t>
+              <w:t>Xem bảng giá phòng khám.</w:t>
             </w:r>
           </w:p>
         </w:tc>
@@ -1662,7 +1709,7 @@
                 <w:sz w:val="24"/>
                 <w:szCs w:val="24"/>
               </w:rPr>
-              <w:t>To Do</w:t>
+              <w:t>Done</w:t>
             </w:r>
           </w:p>
         </w:tc>
@@ -1727,16 +1774,7 @@
                 <w:szCs w:val="24"/>
                 <w:lang w:val="vi-VN"/>
               </w:rPr>
-              <w:t>Xem thông tin hướng dẫn khám bệnh</w:t>
-            </w:r>
-            <w:r>
-              <w:rPr>
-                <w:rFonts w:ascii="Times New Roman" w:eastAsia="Times New Roman" w:hAnsi="Times New Roman" w:cs="Times New Roman"/>
-                <w:sz w:val="24"/>
-                <w:szCs w:val="24"/>
-                <w:lang w:val="vi-VN"/>
-              </w:rPr>
-              <w:t>.</w:t>
+              <w:t>Xem thông tin hướng dẫn khám bệnh.</w:t>
             </w:r>
           </w:p>
         </w:tc>
@@ -1838,7 +1876,7 @@
                 <w:sz w:val="24"/>
                 <w:szCs w:val="24"/>
               </w:rPr>
-              <w:t>To Do</w:t>
+              <w:t>Done</w:t>
             </w:r>
           </w:p>
         </w:tc>
@@ -2013,16 +2051,7 @@
                 <w:sz w:val="24"/>
                 <w:szCs w:val="24"/>
               </w:rPr>
-              <w:t>To</w:t>
-            </w:r>
-            <w:r>
-              <w:rPr>
-                <w:rFonts w:ascii="Times New Roman" w:eastAsia="Times New Roman" w:hAnsi="Times New Roman" w:cs="Times New Roman"/>
-                <w:sz w:val="24"/>
-                <w:szCs w:val="24"/>
-                <w:lang w:val="vi-VN"/>
-              </w:rPr>
-              <w:t xml:space="preserve"> Do</w:t>
+              <w:t>Done</w:t>
             </w:r>
           </w:p>
         </w:tc>
@@ -2240,34 +2269,7 @@
                 <w:szCs w:val="24"/>
                 <w:lang w:val="vi-VN"/>
               </w:rPr>
-              <w:t xml:space="preserve"> </w:t>
-            </w:r>
-            <w:r>
-              <w:rPr>
-                <w:rFonts w:ascii="Times New Roman" w:eastAsia="Times New Roman" w:hAnsi="Times New Roman" w:cs="Times New Roman"/>
-                <w:sz w:val="24"/>
-                <w:szCs w:val="24"/>
-                <w:lang w:val="vi-VN"/>
-              </w:rPr>
-              <w:t xml:space="preserve">UI cho </w:t>
-            </w:r>
-            <w:r>
-              <w:rPr>
-                <w:rFonts w:ascii="Times New Roman" w:eastAsia="Times New Roman" w:hAnsi="Times New Roman" w:cs="Times New Roman"/>
-                <w:sz w:val="24"/>
-                <w:szCs w:val="24"/>
-                <w:lang w:val="vi-VN"/>
-              </w:rPr>
-              <w:t>T</w:t>
-            </w:r>
-            <w:r>
-              <w:rPr>
-                <w:rFonts w:ascii="Times New Roman" w:eastAsia="Times New Roman" w:hAnsi="Times New Roman" w:cs="Times New Roman"/>
-                <w:sz w:val="24"/>
-                <w:szCs w:val="24"/>
-                <w:lang w:val="vi-VN"/>
-              </w:rPr>
-              <w:t xml:space="preserve">rang </w:t>
+              <w:t xml:space="preserve"> UI cho Trang </w:t>
             </w:r>
             <w:r>
               <w:rPr>
@@ -2284,34 +2286,7 @@
                 <w:szCs w:val="24"/>
                 <w:lang w:val="vi-VN"/>
               </w:rPr>
-              <w:t xml:space="preserve"> </w:t>
-            </w:r>
-            <w:r>
-              <w:rPr>
-                <w:rFonts w:ascii="Times New Roman" w:eastAsia="Times New Roman" w:hAnsi="Times New Roman" w:cs="Times New Roman"/>
-                <w:sz w:val="24"/>
-                <w:szCs w:val="24"/>
-                <w:lang w:val="vi-VN"/>
-              </w:rPr>
-              <w:t xml:space="preserve">của </w:t>
-            </w:r>
-            <w:r>
-              <w:rPr>
-                <w:rFonts w:ascii="Times New Roman" w:eastAsia="Times New Roman" w:hAnsi="Times New Roman" w:cs="Times New Roman"/>
-                <w:sz w:val="24"/>
-                <w:szCs w:val="24"/>
-                <w:lang w:val="vi-VN"/>
-              </w:rPr>
-              <w:t xml:space="preserve">tiếp </w:t>
-            </w:r>
-            <w:r>
-              <w:rPr>
-                <w:rFonts w:ascii="Times New Roman" w:eastAsia="Times New Roman" w:hAnsi="Times New Roman" w:cs="Times New Roman"/>
-                <w:sz w:val="24"/>
-                <w:szCs w:val="24"/>
-                <w:lang w:val="vi-VN"/>
-              </w:rPr>
-              <w:t>tân.</w:t>
+              <w:t xml:space="preserve"> của tiếp tân.</w:t>
             </w:r>
           </w:p>
         </w:tc>
@@ -2372,16 +2347,7 @@
                 <w:sz w:val="24"/>
                 <w:szCs w:val="24"/>
               </w:rPr>
-              <w:t>15</w:t>
-            </w:r>
-            <w:r>
-              <w:rPr>
-                <w:rFonts w:ascii="Times New Roman" w:eastAsia="Times New Roman" w:hAnsi="Times New Roman" w:cs="Times New Roman"/>
-                <w:sz w:val="24"/>
-                <w:szCs w:val="24"/>
-                <w:lang w:val="vi-VN"/>
-              </w:rPr>
-              <w:t>/10/2025</w:t>
+              <w:t>10/10/2025</w:t>
             </w:r>
           </w:p>
         </w:tc>
@@ -2406,7 +2372,7 @@
                 <w:sz w:val="24"/>
                 <w:szCs w:val="24"/>
               </w:rPr>
-              <w:t>…</w:t>
+              <w:t>Vanilla JavaScript + HTML5 + CSS3</w:t>
             </w:r>
           </w:p>
         </w:tc>
@@ -2501,16 +2467,7 @@
                 <w:sz w:val="24"/>
                 <w:szCs w:val="24"/>
               </w:rPr>
-              <w:t>15</w:t>
-            </w:r>
-            <w:r>
-              <w:rPr>
-                <w:rFonts w:ascii="Times New Roman" w:eastAsia="Times New Roman" w:hAnsi="Times New Roman" w:cs="Times New Roman"/>
-                <w:sz w:val="24"/>
-                <w:szCs w:val="24"/>
-                <w:lang w:val="vi-VN"/>
-              </w:rPr>
-              <w:t>/10/2025</w:t>
+              <w:t>10/10/2025</w:t>
             </w:r>
           </w:p>
         </w:tc>
@@ -2528,6 +2485,14 @@
                 <w:szCs w:val="24"/>
               </w:rPr>
             </w:pPr>
+            <w:r>
+              <w:rPr>
+                <w:rFonts w:ascii="Times New Roman" w:eastAsia="Times New Roman" w:hAnsi="Times New Roman" w:cs="Times New Roman"/>
+                <w:sz w:val="24"/>
+                <w:szCs w:val="24"/>
+              </w:rPr>
+              <w:t>Vanilla JavaScript + HTML5 + CSS3</w:t>
+            </w:r>
           </w:p>
         </w:tc>
       </w:tr>
@@ -2621,16 +2586,7 @@
                 <w:sz w:val="24"/>
                 <w:szCs w:val="24"/>
               </w:rPr>
-              <w:t>15</w:t>
-            </w:r>
-            <w:r>
-              <w:rPr>
-                <w:rFonts w:ascii="Times New Roman" w:eastAsia="Times New Roman" w:hAnsi="Times New Roman" w:cs="Times New Roman"/>
-                <w:sz w:val="24"/>
-                <w:szCs w:val="24"/>
-                <w:lang w:val="vi-VN"/>
-              </w:rPr>
-              <w:t>/10/2025</w:t>
+              <w:t>10/10/2025</w:t>
             </w:r>
           </w:p>
         </w:tc>
@@ -2648,6 +2604,14 @@
                 <w:szCs w:val="24"/>
               </w:rPr>
             </w:pPr>
+            <w:r>
+              <w:rPr>
+                <w:rFonts w:ascii="Times New Roman" w:eastAsia="Times New Roman" w:hAnsi="Times New Roman" w:cs="Times New Roman"/>
+                <w:sz w:val="24"/>
+                <w:szCs w:val="24"/>
+              </w:rPr>
+              <w:t>Vanilla JavaScript + HTML5 + CSS3</w:t>
+            </w:r>
           </w:p>
         </w:tc>
       </w:tr>
@@ -2741,16 +2705,7 @@
                 <w:sz w:val="24"/>
                 <w:szCs w:val="24"/>
               </w:rPr>
-              <w:t>15</w:t>
-            </w:r>
-            <w:r>
-              <w:rPr>
-                <w:rFonts w:ascii="Times New Roman" w:eastAsia="Times New Roman" w:hAnsi="Times New Roman" w:cs="Times New Roman"/>
-                <w:sz w:val="24"/>
-                <w:szCs w:val="24"/>
-                <w:lang w:val="vi-VN"/>
-              </w:rPr>
-              <w:t>/10/2025</w:t>
+              <w:t>10/10/2025</w:t>
             </w:r>
           </w:p>
         </w:tc>
@@ -2768,6 +2723,14 @@
                 <w:szCs w:val="24"/>
               </w:rPr>
             </w:pPr>
+            <w:r>
+              <w:rPr>
+                <w:rFonts w:ascii="Times New Roman" w:eastAsia="Times New Roman" w:hAnsi="Times New Roman" w:cs="Times New Roman"/>
+                <w:sz w:val="24"/>
+                <w:szCs w:val="24"/>
+              </w:rPr>
+              <w:t>Vanilla JavaScript + HTML5 + CSS3</w:t>
+            </w:r>
           </w:p>
         </w:tc>
       </w:tr>
@@ -2861,16 +2824,7 @@
                 <w:sz w:val="24"/>
                 <w:szCs w:val="24"/>
               </w:rPr>
-              <w:t>15</w:t>
-            </w:r>
-            <w:r>
-              <w:rPr>
-                <w:rFonts w:ascii="Times New Roman" w:eastAsia="Times New Roman" w:hAnsi="Times New Roman" w:cs="Times New Roman"/>
-                <w:sz w:val="24"/>
-                <w:szCs w:val="24"/>
-                <w:lang w:val="vi-VN"/>
-              </w:rPr>
-              <w:t>/10/2025</w:t>
+              <w:t>10/10/2025</w:t>
             </w:r>
           </w:p>
         </w:tc>
@@ -2888,6 +2842,14 @@
                 <w:szCs w:val="24"/>
               </w:rPr>
             </w:pPr>
+            <w:r>
+              <w:rPr>
+                <w:rFonts w:ascii="Times New Roman" w:eastAsia="Times New Roman" w:hAnsi="Times New Roman" w:cs="Times New Roman"/>
+                <w:sz w:val="24"/>
+                <w:szCs w:val="24"/>
+              </w:rPr>
+              <w:t>Vanilla JavaScript + HTML5 + CSS3</w:t>
+            </w:r>
           </w:p>
         </w:tc>
       </w:tr>
@@ -2983,16 +2945,7 @@
                 <w:sz w:val="24"/>
                 <w:szCs w:val="24"/>
               </w:rPr>
-              <w:t>15</w:t>
-            </w:r>
-            <w:r>
-              <w:rPr>
-                <w:rFonts w:ascii="Times New Roman" w:eastAsia="Times New Roman" w:hAnsi="Times New Roman" w:cs="Times New Roman"/>
-                <w:sz w:val="24"/>
-                <w:szCs w:val="24"/>
-                <w:lang w:val="vi-VN"/>
-              </w:rPr>
-              <w:t>/10/2025</w:t>
+              <w:t>10/10/2025</w:t>
             </w:r>
           </w:p>
         </w:tc>
@@ -3010,6 +2963,14 @@
                 <w:szCs w:val="24"/>
               </w:rPr>
             </w:pPr>
+            <w:r>
+              <w:rPr>
+                <w:rFonts w:ascii="Times New Roman" w:eastAsia="Times New Roman" w:hAnsi="Times New Roman" w:cs="Times New Roman"/>
+                <w:sz w:val="24"/>
+                <w:szCs w:val="24"/>
+              </w:rPr>
+              <w:t>Vanilla JavaScript + HTML5 + CSS3</w:t>
+            </w:r>
           </w:p>
         </w:tc>
       </w:tr>
@@ -3104,16 +3065,7 @@
                 <w:sz w:val="24"/>
                 <w:szCs w:val="24"/>
               </w:rPr>
-              <w:t>15</w:t>
-            </w:r>
-            <w:r>
-              <w:rPr>
-                <w:rFonts w:ascii="Times New Roman" w:eastAsia="Times New Roman" w:hAnsi="Times New Roman" w:cs="Times New Roman"/>
-                <w:sz w:val="24"/>
-                <w:szCs w:val="24"/>
-                <w:lang w:val="vi-VN"/>
-              </w:rPr>
-              <w:t>/10/2025</w:t>
+              <w:t>10/10/2025</w:t>
             </w:r>
           </w:p>
         </w:tc>
@@ -3131,6 +3083,14 @@
                 <w:szCs w:val="24"/>
               </w:rPr>
             </w:pPr>
+            <w:r>
+              <w:rPr>
+                <w:rFonts w:ascii="Times New Roman" w:eastAsia="Times New Roman" w:hAnsi="Times New Roman" w:cs="Times New Roman"/>
+                <w:sz w:val="24"/>
+                <w:szCs w:val="24"/>
+              </w:rPr>
+              <w:t>ASP.NET Core Web API (C#)</w:t>
+            </w:r>
           </w:p>
         </w:tc>
       </w:tr>
@@ -3229,16 +3189,7 @@
                 <w:sz w:val="24"/>
                 <w:szCs w:val="24"/>
               </w:rPr>
-              <w:t>15</w:t>
-            </w:r>
-            <w:r>
-              <w:rPr>
-                <w:rFonts w:ascii="Times New Roman" w:eastAsia="Times New Roman" w:hAnsi="Times New Roman" w:cs="Times New Roman"/>
-                <w:sz w:val="24"/>
-                <w:szCs w:val="24"/>
-                <w:lang w:val="vi-VN"/>
-              </w:rPr>
-              <w:t>/10/2025</w:t>
+              <w:t>10/10/2025</w:t>
             </w:r>
           </w:p>
         </w:tc>
@@ -3263,7 +3214,7 @@
                 <w:sz w:val="24"/>
                 <w:szCs w:val="24"/>
               </w:rPr>
-              <w:t>…</w:t>
+              <w:t>ASP.NET Core Web API (C#)</w:t>
             </w:r>
           </w:p>
         </w:tc>
@@ -3301,16 +3252,7 @@
                 <w:szCs w:val="24"/>
                 <w:lang w:val="vi-VN"/>
               </w:rPr>
-              <w:t xml:space="preserve"> quan đến </w:t>
-            </w:r>
-            <w:r>
-              <w:rPr>
-                <w:rFonts w:ascii="Times New Roman" w:eastAsia="Times New Roman" w:hAnsi="Times New Roman" w:cs="Times New Roman"/>
-                <w:sz w:val="24"/>
-                <w:szCs w:val="24"/>
-                <w:lang w:val="vi-VN"/>
-              </w:rPr>
-              <w:t>bảng giá khám.</w:t>
+              <w:t xml:space="preserve"> quan đến bảng giá khám.</w:t>
             </w:r>
           </w:p>
         </w:tc>
@@ -3367,16 +3309,7 @@
                 <w:sz w:val="24"/>
                 <w:szCs w:val="24"/>
               </w:rPr>
-              <w:t>15</w:t>
-            </w:r>
-            <w:r>
-              <w:rPr>
-                <w:rFonts w:ascii="Times New Roman" w:eastAsia="Times New Roman" w:hAnsi="Times New Roman" w:cs="Times New Roman"/>
-                <w:sz w:val="24"/>
-                <w:szCs w:val="24"/>
-                <w:lang w:val="vi-VN"/>
-              </w:rPr>
-              <w:t>/10/2025</w:t>
+              <w:t>10/10/2025</w:t>
             </w:r>
           </w:p>
         </w:tc>
@@ -3394,6 +3327,14 @@
                 <w:szCs w:val="24"/>
               </w:rPr>
             </w:pPr>
+            <w:r>
+              <w:rPr>
+                <w:rFonts w:ascii="Times New Roman" w:eastAsia="Times New Roman" w:hAnsi="Times New Roman" w:cs="Times New Roman"/>
+                <w:sz w:val="24"/>
+                <w:szCs w:val="24"/>
+              </w:rPr>
+              <w:t>ASP.NET Core Web API (C#)</w:t>
+            </w:r>
           </w:p>
         </w:tc>
       </w:tr>
@@ -3430,16 +3371,7 @@
                 <w:szCs w:val="24"/>
                 <w:lang w:val="vi-VN"/>
               </w:rPr>
-              <w:t xml:space="preserve"> quan đến </w:t>
-            </w:r>
-            <w:r>
-              <w:rPr>
-                <w:rFonts w:ascii="Times New Roman" w:eastAsia="Times New Roman" w:hAnsi="Times New Roman" w:cs="Times New Roman"/>
-                <w:sz w:val="24"/>
-                <w:szCs w:val="24"/>
-                <w:lang w:val="vi-VN"/>
-              </w:rPr>
-              <w:t>bảng tin y tế.</w:t>
+              <w:t xml:space="preserve"> quan đến bảng tin y tế.</w:t>
             </w:r>
           </w:p>
         </w:tc>
@@ -3496,16 +3428,7 @@
                 <w:sz w:val="24"/>
                 <w:szCs w:val="24"/>
               </w:rPr>
-              <w:t>15</w:t>
-            </w:r>
-            <w:r>
-              <w:rPr>
-                <w:rFonts w:ascii="Times New Roman" w:eastAsia="Times New Roman" w:hAnsi="Times New Roman" w:cs="Times New Roman"/>
-                <w:sz w:val="24"/>
-                <w:szCs w:val="24"/>
-                <w:lang w:val="vi-VN"/>
-              </w:rPr>
-              <w:t>/10/2025</w:t>
+              <w:t>10/10/2025</w:t>
             </w:r>
           </w:p>
         </w:tc>
@@ -3523,6 +3446,14 @@
                 <w:szCs w:val="24"/>
               </w:rPr>
             </w:pPr>
+            <w:r>
+              <w:rPr>
+                <w:rFonts w:ascii="Times New Roman" w:eastAsia="Times New Roman" w:hAnsi="Times New Roman" w:cs="Times New Roman"/>
+                <w:sz w:val="24"/>
+                <w:szCs w:val="24"/>
+              </w:rPr>
+              <w:t>ASP.NET Core Web API (C#)</w:t>
+            </w:r>
           </w:p>
         </w:tc>
       </w:tr>
@@ -4592,6 +4523,7 @@
   <w:style w:type="character" w:default="1" w:styleId="Phngmcinhcuaoanvn">
     <w:name w:val="Default Paragraph Font"/>
     <w:uiPriority w:val="1"/>
+    <w:semiHidden/>
     <w:unhideWhenUsed/>
   </w:style>
   <w:style w:type="table" w:default="1" w:styleId="BangThngthng">

</xml_diff>